<commit_message>
Update Developer Manual: Add prominent warning box for Branch Protection Rulesets
</commit_message>
<xml_diff>
--- a/System_Setup_Guide.docx
+++ b/System_Setup_Guide.docx
@@ -346,7 +346,7 @@
           <w:color w:val="0E7490"/>
           <w:sz w:val="26"/>
         </w:rPr>
-        <w:t>ส่วนที่ 3: การจัดการสิทธิ์โฟลเดอร์สำหรับ Antigravity เพื่อไม่ให้ถามซ้ำ</w:t>
+        <w:t>ส่วนที่ 3: การตั้งค่าโฟลเดอร์ให้สิทธิ์เข้าถึงถาวรของ Antigravity โดยไม่ต้องถามซ้ำ</w:t>
       </w:r>
     </w:p>
     <w:p>
@@ -436,12 +436,90 @@
         <w:t>ส่วนที่ 4: การตั้งค่าความปลอดภัยของ Branch บน GitHub (Branch Protection Rulesets)</w:t>
       </w:r>
     </w:p>
+    <w:tbl>
+      <w:tblPr>
+        <w:tblW w:type="auto" w:w="0"/>
+        <w:jc w:val="center"/>
+        <w:tblLayout w:type="fixed"/>
+        <w:tblLook w:firstColumn="1" w:firstRow="1" w:lastColumn="0" w:lastRow="0" w:noHBand="0" w:noVBand="1" w:val="04A0"/>
+      </w:tblPr>
+      <w:tblGrid>
+        <w:gridCol w:w="8640"/>
+      </w:tblGrid>
+      <w:tr>
+        <w:tc>
+          <w:tcPr>
+            <w:tcW w:type="dxa" w:w="8640"/>
+            <w:shd w:fill="FEE2E2"/>
+            <w:tcMar>
+              <w:top w:w="140" w:type="dxa"/>
+              <w:bottom w:w="140" w:type="dxa"/>
+              <w:left w:w="200" w:type="dxa"/>
+              <w:right w:w="180" w:type="dxa"/>
+            </w:tcMar>
+            <w:tcBorders>
+              <w:top w:val="none"/>
+              <w:left w:val="single" w:sz="24" w:space="0" w:color="EF4444"/>
+              <w:bottom w:val="none"/>
+              <w:right w:val="none"/>
+            </w:tcBorders>
+          </w:tcPr>
+          <w:p>
+            <w:pPr>
+              <w:spacing w:before="0" w:after="40"/>
+            </w:pPr>
+            <w:r>
+              <w:rPr>
+                <w:rFonts w:ascii="Sarabun" w:hAnsi="Sarabun"/>
+                <w:b/>
+                <w:color w:val="EF4444"/>
+                <w:sz w:val="21"/>
+              </w:rPr>
+              <w:t>★ ⚠️ ขั้นตอนสำคัญที่สุด: นโยบายการคุ้มครองและตั้งค่า Branch Ruleset บนคลาวด์</w:t>
+              <w:br/>
+            </w:r>
+            <w:r>
+              <w:rPr>
+                <w:rFonts w:ascii="Sarabun" w:hAnsi="Sarabun"/>
+                <w:i/>
+                <w:color w:val="333333"/>
+                <w:sz w:val="19"/>
+              </w:rPr>
+              <w:t>แนะนำให้ทำการตั้งค่าเพื่อความปลอดภัยสูงสุดของโครงการ (สร้างไว้ปลอดภัยกว่า):</w:t>
+              <w:br/>
+              <w:br/>
+              <w:t>■ การทำงานร่วมกับคนอื่น:</w:t>
+              <w:br/>
+              <w:t xml:space="preserve">  - ช่วยป้องกันไม่ให้ผู้อื่นในทีมแอบลบ Main Branch หรือทำการอัปโหลดโค้ดตรงเข้า Main ตรง ๆ โดยไม่ผ่านการตรวจสอบและอนุมัติ</w:t>
+              <w:br/>
+              <w:br/>
+              <w:t>■ การป้องกันความผิดพลาดของตัวเอง:</w:t>
+              <w:br/>
+              <w:t xml:space="preserve">  - ช่วยป้องกันกรณีที่เราเผลอรันใช้คำสั่งรุนแรง เช่น 'git push --force' ซึ่งจะส่งผลให้ไปทับข้อมูลและทำลายประวัติโค้ดตัวเก่าบน Cloud จนหายสาบสูญ</w:t>
+              <w:br/>
+              <w:br/>
+              <w:t>💡 คำแนะนำขั้นตอนในการกำหนดตั้งค่าความปลอดภัย Branch Ruleset:</w:t>
+              <w:br/>
+              <w:t xml:space="preserve">  - Target branches: ระบุใส่ชื่อ Branch หลักที่ต้องการปกป้องคุ้มครอง (พิมพ์ว่า 'main')</w:t>
+              <w:br/>
+              <w:t xml:space="preserve">  - Protect changes:</w:t>
+              <w:br/>
+              <w:t xml:space="preserve">    [✓] ติ๊กถูกที่ Restrict deletions (ห้ามไม่ให้ใครกดลบ Branch นี้)</w:t>
+              <w:br/>
+              <w:t xml:space="preserve">    [✓] ติ๊กถูกที่ Restrict updates -&gt; เลือก Block force pushes (บล็อกห้าม Force Push ทุกกรณี)</w:t>
+              <w:br/>
+              <w:t xml:space="preserve">    [✓] Require a pull request before merging: (ตัวเลือกเสริมหากต้องการความปลอดภัยสูงมาก) เพื่อบังคับให้ตัวเองและทีมต้องสร้างและตรวจสอบผ่าน Pull Request ก่อนรวมโค้ดเข้าสู่ Branch หลัก</w:t>
+            </w:r>
+          </w:p>
+        </w:tc>
+      </w:tr>
+    </w:tbl>
     <w:p>
       <w:pPr>
         <w:spacing w:after="160"/>
       </w:pPr>
       <w:r>
-        <w:t>เนื่องจากระบบถูกออกแบบให้นำโค้ดขึ้นแสดงผลออนไลน์เป็น Dashboard ผ่านหน้าหลักของ Branch ตลอดเวลา ดังนั้น ความสม่ำเสมอของประวัติและรหัสต้นฉบับจึงสำคัญมาก การกำหนดนโยบายความปลอดภัยจึงเป็นเรื่องจำเป็นสูงสุด:</w:t>
+        <w:t>นโยบายการปกป้องการผลักประวัติโค้ดทับซ้อน (Git Ruleset Setup) ช่วยยืนยันความคงอยู่ของฐานข้อมูลรหัสของระบบมอนิเตอร์ยาอย่างสมบูรณ์แบบ โดยสามารถแบ่งรายละเอียดผลการทำงานร่วมกันกับรูปภาพประกอบทางขวาได้ดังนี้:</w:t>
       </w:r>
     </w:p>
     <w:tbl>
@@ -483,14 +561,14 @@
                 <w:color w:val="0891B2"/>
                 <w:sz w:val="19"/>
               </w:rPr>
-              <w:t xml:space="preserve">1) ป้องกันการลบ Branch หลัก (Restrict Deletions): </w:t>
+              <w:t xml:space="preserve">1) ห้ามลบ Branch (Restrict Deletions): </w:t>
             </w:r>
             <w:r>
               <w:rPr>
                 <w:color w:val="334155"/>
                 <w:sz w:val="18"/>
               </w:rPr>
-              <w:t>การเลือกหัวข้อนี้จะบล็อกไม่ให้ใครก็ตามทำการลบ Branch หลักของโครงการทิ้งโดยเจตนาหรืออุบัติเหตุ</w:t>
+              <w:t>บล็อกสิทธิ์การลบ branch หลักถาวร ช่วยป้องกันเหตุการณ์ลบผิดโดยไม่ได้ตั้งใจ</w:t>
             </w:r>
           </w:p>
           <w:p>
@@ -503,14 +581,14 @@
                 <w:color w:val="0891B2"/>
                 <w:sz w:val="19"/>
               </w:rPr>
-              <w:t xml:space="preserve">2) ป้องกันการผลักโค้ดทับประวัติเดิม (Block Force Pushes): </w:t>
+              <w:t xml:space="preserve">2) ห้าม Force Push (Block Force Pushes): </w:t>
             </w:r>
             <w:r>
               <w:rPr>
                 <w:color w:val="334155"/>
                 <w:sz w:val="18"/>
               </w:rPr>
-              <w:t>การเลือกข้อนี้เป็นเกณฑ์พื้นฐานที่สำคัญที่สุด เพื่อป้องกันไม่ให้เจ้าหน้าที่เผลอรันคำสั่ง 'git push --force' ซึ่งจะไปทำลายโครงสร้างและลบประวัติของโค้ดเก่าบนระบบคลาวด์จนหายเกลี้ยงและกู้กลับมาไม่ได้</w:t>
+              <w:t>ล็อคประวัติการ commit บนระบบคลาวด์ให้อยู่ครบถ้วน ป้องกันอุบัติเหตุเขียนทับรหัสเดิม</w:t>
             </w:r>
           </w:p>
           <w:p>
@@ -523,16 +601,16 @@
                 <w:color w:val="0891B2"/>
                 <w:sz w:val="19"/>
               </w:rPr>
-              <w:t xml:space="preserve">3) ข้อควรระวังในการตั้งค่า Pull Request (PR): </w:t>
+              <w:t xml:space="preserve">3) ข้อจำกัดด้านการขอสิทธิ์ PR (Pull Request Constraint): </w:t>
             </w:r>
             <w:r>
               <w:rPr>
                 <w:color w:val="334155"/>
                 <w:sz w:val="18"/>
               </w:rPr>
-              <w:t xml:space="preserve">หากคุณเปิดตัวเลือก 'Require a pull request before merging' เพื่อป้องกันไม่ให้คนอื่นมาเปลี่ยนโค้ดโดยไม่ผ่านความเห็นชอบ </w:t>
+              <w:t xml:space="preserve">หากคุณติ๊กถูกเปิดใช้งานหัวข้อ 'Require a pull request before merging' เพื่อตรวจโค้ดเข้มงวด </w:t>
               <w:br/>
-              <w:t xml:space="preserve">  ⚠️ ผลกระทบ: Antigravity จะถูกระงับสิทธิ์ในการ 'git push' ส่งข้อมูลตรงเข้า Branch หลักโดยตรงด้วยเช่นกัน โดยจะต้องส่งผ่านการสร้าง Pull Request เพื่อให้คุณกดอนุมัติก่อนเสมอ</w:t>
+              <w:t xml:space="preserve">  ⚠️ ผลกระทบเชิงระบบ: บัญชี AI Antigravity จะไม่สามารถสั่ง push โค้ดที่พัฒนาตรงเข้า main ได้โดยตรงเช่นเดียวกัน โดยโค้ดจะค้างและต้องผ่านการดึงเข้าระบบด้วย Pull Request ในเบราว์เซอร์แทน</w:t>
             </w:r>
           </w:p>
         </w:tc>

</xml_diff>